<commit_message>
fix(ui): perbaikan beberapa UI
</commit_message>
<xml_diff>
--- a/usecasepoint.docx
+++ b/usecasepoint.docx
@@ -1,23 +1,10 @@
 
 <file path=word/document.xml><?xml version="1.0" encoding="utf-8"?>
-<w:document xmlns:wpc="http://schemas.microsoft.com/office/word/2010/wordprocessingCanvas" xmlns:cx="http://schemas.microsoft.com/office/drawing/2014/chartex" xmlns:cx1="http://schemas.microsoft.com/office/drawing/2015/9/8/chartex" xmlns:cx2="http://schemas.microsoft.com/office/drawing/2015/10/21/chartex" xmlns:cx3="http://schemas.microsoft.com/office/drawing/2016/5/9/chartex" xmlns:cx4="http://schemas.microsoft.com/office/drawing/2016/5/10/chartex" xmlns:cx5="http://schemas.microsoft.com/office/drawing/2016/5/11/chartex" xmlns:cx6="http://schemas.microsoft.com/office/drawing/2016/5/12/chartex" xmlns:cx7="http://schemas.microsoft.com/office/drawing/2016/5/13/chartex" xmlns:cx8="http://schemas.microsoft.com/office/drawing/2016/5/14/chartex" xmlns:mc="http://schemas.openxmlformats.org/markup-compatibility/2006" xmlns:aink="http://schemas.microsoft.com/office/drawing/2016/ink" xmlns:am3d="http://schemas.microsoft.com/office/drawing/2017/model3d" xmlns:o="urn:schemas-microsoft-com:office:office" xmlns:oel="http://schemas.microsoft.com/office/2019/extlst" xmlns:r="http://schemas.openxmlformats.org/officeDocument/2006/relationships" xmlns:m="http://schemas.openxmlformats.org/officeDocument/2006/math" xmlns:v="urn:schemas-microsoft-com:vml" xmlns:wp14="http://schemas.microsoft.com/office/word/2010/wordprocessingDrawing" xmlns:wp="http://schemas.openxmlformats.org/drawingml/2006/wordprocessingDrawing" xmlns:w10="urn:schemas-microsoft-com:office:word" xmlns:w="http://schemas.openxmlformats.org/wordprocessingml/2006/main" xmlns:w14="http://schemas.microsoft.com/office/word/2010/wordml" xmlns:w15="http://schemas.microsoft.com/office/word/2012/wordml" xmlns:w16cex="http://schemas.microsoft.com/office/word/2018/wordml/cex" xmlns:w16cid="http://schemas.microsoft.com/office/word/2016/wordml/cid" xmlns:w16="http://schemas.microsoft.com/office/word/2018/wordml" xmlns:w16sdtdh="http://schemas.microsoft.com/office/word/2020/wordml/sdtdatahash" xmlns:w16se="http://schemas.microsoft.com/office/word/2015/wordml/symex" xmlns:wpg="http://schemas.microsoft.com/office/word/2010/wordprocessingGroup" xmlns:wpi="http://schemas.microsoft.com/office/word/2010/wordprocessingInk" xmlns:wne="http://schemas.microsoft.com/office/word/2006/wordml" xmlns:wps="http://schemas.microsoft.com/office/word/2010/wordprocessingShape" mc:Ignorable="w14 w15 w16se w16cid w16 w16cex w16sdtdh wp14">
+<w:document xmlns:wpc="http://schemas.microsoft.com/office/word/2010/wordprocessingCanvas" xmlns:cx="http://schemas.microsoft.com/office/drawing/2014/chartex" xmlns:cx1="http://schemas.microsoft.com/office/drawing/2015/9/8/chartex" xmlns:cx2="http://schemas.microsoft.com/office/drawing/2015/10/21/chartex" xmlns:cx3="http://schemas.microsoft.com/office/drawing/2016/5/9/chartex" xmlns:cx4="http://schemas.microsoft.com/office/drawing/2016/5/10/chartex" xmlns:cx5="http://schemas.microsoft.com/office/drawing/2016/5/11/chartex" xmlns:cx6="http://schemas.microsoft.com/office/drawing/2016/5/12/chartex" xmlns:cx7="http://schemas.microsoft.com/office/drawing/2016/5/13/chartex" xmlns:cx8="http://schemas.microsoft.com/office/drawing/2016/5/14/chartex" xmlns:mc="http://schemas.openxmlformats.org/markup-compatibility/2006" xmlns:aink="http://schemas.microsoft.com/office/drawing/2016/ink" xmlns:am3d="http://schemas.microsoft.com/office/drawing/2017/model3d" xmlns:o="urn:schemas-microsoft-com:office:office" xmlns:oel="http://schemas.microsoft.com/office/2019/extlst" xmlns:r="http://schemas.openxmlformats.org/officeDocument/2006/relationships" xmlns:m="http://schemas.openxmlformats.org/officeDocument/2006/math" xmlns:v="urn:schemas-microsoft-com:vml" xmlns:wp14="http://schemas.microsoft.com/office/word/2010/wordprocessingDrawing" xmlns:wp="http://schemas.openxmlformats.org/drawingml/2006/wordprocessingDrawing" xmlns:w10="urn:schemas-microsoft-com:office:word" xmlns:w="http://schemas.openxmlformats.org/wordprocessingml/2006/main" xmlns:w14="http://schemas.microsoft.com/office/word/2010/wordml" xmlns:w15="http://schemas.microsoft.com/office/word/2012/wordml" xmlns:w16cex="http://schemas.microsoft.com/office/word/2018/wordml/cex" xmlns:w16cid="http://schemas.microsoft.com/office/word/2016/wordml/cid" xmlns:w16="http://schemas.microsoft.com/office/word/2018/wordml" xmlns:w16du="http://schemas.microsoft.com/office/word/2023/wordml/word16du" xmlns:w16sdtdh="http://schemas.microsoft.com/office/word/2020/wordml/sdtdatahash" xmlns:w16sdtfl="http://schemas.microsoft.com/office/word/2024/wordml/sdtformatlock" xmlns:w16se="http://schemas.microsoft.com/office/word/2015/wordml/symex" xmlns:wpg="http://schemas.microsoft.com/office/word/2010/wordprocessingGroup" xmlns:wpi="http://schemas.microsoft.com/office/word/2010/wordprocessingInk" xmlns:wne="http://schemas.microsoft.com/office/word/2006/wordml" xmlns:wps="http://schemas.microsoft.com/office/word/2010/wordprocessingShape" mc:Ignorable="w14 w15 w16se w16cid w16 w16cex w16sdtdh w16sdtfl w16du wp14">
   <w:body>
     <w:p>
-      <w:proofErr w:type="spellStart"/>
-      <w:r>
-        <w:t>Teori</w:t>
-      </w:r>
-      <w:proofErr w:type="spellEnd"/>
-      <w:r>
-        <w:t xml:space="preserve"> Gustav </w:t>
-      </w:r>
-      <w:proofErr w:type="spellStart"/>
-      <w:r>
-        <w:t>Karner</w:t>
-      </w:r>
-      <w:proofErr w:type="spellEnd"/>
-      <w:r>
-        <w:t xml:space="preserve"> </w:t>
+      <w:r>
+        <w:t xml:space="preserve">Teori Gustav Karner </w:t>
       </w:r>
       <w:r>
         <w:t xml:space="preserve">dan </w:t>
@@ -291,23 +278,7 @@
           <w:sz w:val="20"/>
           <w:szCs w:val="18"/>
         </w:rPr>
-        <w:t xml:space="preserve"> 5 </w:t>
-      </w:r>
-      <w:proofErr w:type="spellStart"/>
-      <w:r>
-        <w:rPr>
-          <w:sz w:val="20"/>
-          <w:szCs w:val="18"/>
-        </w:rPr>
-        <w:t>Aktor</w:t>
-      </w:r>
-      <w:proofErr w:type="spellEnd"/>
-      <w:r>
-        <w:rPr>
-          <w:sz w:val="20"/>
-          <w:szCs w:val="18"/>
-        </w:rPr>
-        <w:t>:</w:t>
+        <w:t xml:space="preserve"> 5 Aktor:</w:t>
       </w:r>
     </w:p>
     <w:tbl>
@@ -337,20 +308,42 @@
                 <w:szCs w:val="18"/>
               </w:rPr>
             </w:pPr>
+            <w:r>
+              <w:rPr>
+                <w:sz w:val="20"/>
+                <w:szCs w:val="18"/>
+              </w:rPr>
+              <w:t>Aktor</w:t>
+            </w:r>
+          </w:p>
+        </w:tc>
+        <w:tc>
+          <w:tcPr>
+            <w:tcW w:w="1657" w:type="dxa"/>
+          </w:tcPr>
+          <w:p>
+            <w:pPr>
+              <w:pStyle w:val="ListParagraph"/>
+              <w:ind w:left="0"/>
+              <w:rPr>
+                <w:sz w:val="20"/>
+                <w:szCs w:val="18"/>
+              </w:rPr>
+            </w:pPr>
             <w:proofErr w:type="spellStart"/>
             <w:r>
               <w:rPr>
                 <w:sz w:val="20"/>
                 <w:szCs w:val="18"/>
               </w:rPr>
-              <w:t>Aktor</w:t>
+              <w:t>Tipe</w:t>
             </w:r>
             <w:proofErr w:type="spellEnd"/>
           </w:p>
         </w:tc>
         <w:tc>
           <w:tcPr>
-            <w:tcW w:w="1657" w:type="dxa"/>
+            <w:tcW w:w="1673" w:type="dxa"/>
           </w:tcPr>
           <w:p>
             <w:pPr>
@@ -367,37 +360,13 @@
                 <w:sz w:val="20"/>
                 <w:szCs w:val="18"/>
               </w:rPr>
-              <w:t>Tipe</w:t>
+              <w:t>Bobot</w:t>
             </w:r>
             <w:proofErr w:type="spellEnd"/>
           </w:p>
         </w:tc>
         <w:tc>
           <w:tcPr>
-            <w:tcW w:w="1673" w:type="dxa"/>
-          </w:tcPr>
-          <w:p>
-            <w:pPr>
-              <w:pStyle w:val="ListParagraph"/>
-              <w:ind w:left="0"/>
-              <w:rPr>
-                <w:sz w:val="20"/>
-                <w:szCs w:val="18"/>
-              </w:rPr>
-            </w:pPr>
-            <w:proofErr w:type="spellStart"/>
-            <w:r>
-              <w:rPr>
-                <w:sz w:val="20"/>
-                <w:szCs w:val="18"/>
-              </w:rPr>
-              <w:t>Bobot</w:t>
-            </w:r>
-            <w:proofErr w:type="spellEnd"/>
-          </w:p>
-        </w:tc>
-        <w:tc>
-          <w:tcPr>
             <w:tcW w:w="2655" w:type="dxa"/>
           </w:tcPr>
           <w:p>
@@ -409,7 +378,6 @@
                 <w:szCs w:val="18"/>
               </w:rPr>
             </w:pPr>
-            <w:proofErr w:type="spellStart"/>
             <w:r>
               <w:rPr>
                 <w:sz w:val="20"/>
@@ -417,7 +385,6 @@
               </w:rPr>
               <w:t>Alasan</w:t>
             </w:r>
-            <w:proofErr w:type="spellEnd"/>
           </w:p>
         </w:tc>
       </w:tr>
@@ -441,7 +408,14 @@
                 <w:sz w:val="20"/>
                 <w:szCs w:val="18"/>
               </w:rPr>
-              <w:t>Petuga</w:t>
+              <w:t>Petug</w:t>
+            </w:r>
+            <w:r>
+              <w:rPr>
+                <w:sz w:val="20"/>
+                <w:szCs w:val="18"/>
+              </w:rPr>
+              <w:t>as</w:t>
             </w:r>
             <w:proofErr w:type="spellEnd"/>
             <w:r>
@@ -2717,39 +2691,7 @@
             <w:sz w:val="20"/>
             <w:szCs w:val="18"/>
           </w:rPr>
-          <m:t>3</m:t>
-        </m:r>
-        <m:r>
-          <w:rPr>
-            <w:rFonts w:ascii="Cambria Math" w:hAnsi="Cambria Math"/>
-            <w:sz w:val="20"/>
-            <w:szCs w:val="18"/>
-          </w:rPr>
-          <m:t>+</m:t>
-        </m:r>
-        <m:r>
-          <w:rPr>
-            <w:rFonts w:ascii="Cambria Math" w:hAnsi="Cambria Math"/>
-            <w:sz w:val="20"/>
-            <w:szCs w:val="18"/>
-          </w:rPr>
-          <m:t>75</m:t>
-        </m:r>
-        <m:r>
-          <w:rPr>
-            <w:rFonts w:ascii="Cambria Math" w:hAnsi="Cambria Math"/>
-            <w:sz w:val="20"/>
-            <w:szCs w:val="18"/>
-          </w:rPr>
-          <m:t>=</m:t>
-        </m:r>
-        <m:r>
-          <w:rPr>
-            <w:rFonts w:ascii="Cambria Math" w:hAnsi="Cambria Math"/>
-            <w:sz w:val="20"/>
-            <w:szCs w:val="18"/>
-          </w:rPr>
-          <m:t>78</m:t>
+          <m:t>3+75=78</m:t>
         </m:r>
       </m:oMath>
     </w:p>
@@ -2949,23 +2891,7 @@
           <w:sz w:val="20"/>
           <w:szCs w:val="18"/>
         </w:rPr>
-        <w:t xml:space="preserve"> </w:t>
-      </w:r>
-      <w:proofErr w:type="spellStart"/>
-      <w:r>
-        <w:rPr>
-          <w:sz w:val="20"/>
-          <w:szCs w:val="18"/>
-        </w:rPr>
-        <w:t>Karner</w:t>
-      </w:r>
-      <w:proofErr w:type="spellEnd"/>
-      <w:r>
-        <w:rPr>
-          <w:sz w:val="20"/>
-          <w:szCs w:val="18"/>
-        </w:rPr>
-        <w:t xml:space="preserve"> (1993) dan Schneider &amp; Winters (1998), </w:t>
+        <w:t xml:space="preserve"> Karner (1993) dan Schneider &amp; Winters (1998), </w:t>
       </w:r>
       <w:proofErr w:type="spellStart"/>
       <w:r>
@@ -4910,15 +4836,7 @@
                 <w:sz w:val="20"/>
                 <w:szCs w:val="18"/>
               </w:rPr>
-              <m:t>0,01∙</m:t>
-            </m:r>
-            <m:r>
-              <w:rPr>
-                <w:rFonts w:ascii="Cambria Math" w:hAnsi="Cambria Math"/>
-                <w:sz w:val="20"/>
-                <w:szCs w:val="18"/>
-              </w:rPr>
-              <m:t>38</m:t>
+              <m:t>0,01∙38</m:t>
             </m:r>
           </m:e>
         </m:d>
@@ -4928,31 +4846,7 @@
             <w:sz w:val="20"/>
             <w:szCs w:val="18"/>
           </w:rPr>
-          <m:t>=0,6+0,</m:t>
-        </m:r>
-        <m:r>
-          <w:rPr>
-            <w:rFonts w:ascii="Cambria Math" w:hAnsi="Cambria Math"/>
-            <w:sz w:val="20"/>
-            <w:szCs w:val="18"/>
-          </w:rPr>
-          <m:t>38</m:t>
-        </m:r>
-        <m:r>
-          <w:rPr>
-            <w:rFonts w:ascii="Cambria Math" w:hAnsi="Cambria Math"/>
-            <w:sz w:val="20"/>
-            <w:szCs w:val="18"/>
-          </w:rPr>
-          <m:t>=</m:t>
-        </m:r>
-        <m:r>
-          <w:rPr>
-            <w:rFonts w:ascii="Cambria Math" w:hAnsi="Cambria Math"/>
-            <w:sz w:val="20"/>
-            <w:szCs w:val="18"/>
-          </w:rPr>
-          <m:t>0,98</m:t>
+          <m:t>=0,6+0,38=0,98</m:t>
         </m:r>
       </m:oMath>
     </w:p>
@@ -5620,23 +5514,7 @@
           <w:sz w:val="20"/>
           <w:szCs w:val="18"/>
         </w:rPr>
-        <w:t xml:space="preserve"> </w:t>
-      </w:r>
-      <w:proofErr w:type="spellStart"/>
-      <w:r>
-        <w:rPr>
-          <w:sz w:val="20"/>
-          <w:szCs w:val="18"/>
-        </w:rPr>
-        <w:t>Karner</w:t>
-      </w:r>
-      <w:proofErr w:type="spellEnd"/>
-      <w:r>
-        <w:rPr>
-          <w:sz w:val="20"/>
-          <w:szCs w:val="18"/>
-        </w:rPr>
-        <w:t xml:space="preserve"> (1993) dan Schneider &amp; Winters (1998), </w:t>
+        <w:t xml:space="preserve"> Karner (1993) dan Schneider &amp; Winters (1998), </w:t>
       </w:r>
       <w:proofErr w:type="spellStart"/>
       <w:r>
@@ -7109,15 +6987,7 @@
                 <w:sz w:val="20"/>
                 <w:szCs w:val="18"/>
               </w:rPr>
-              <m:t>-0.03∙</m:t>
-            </m:r>
-            <m:r>
-              <w:rPr>
-                <w:rFonts w:ascii="Cambria Math" w:hAnsi="Cambria Math"/>
-                <w:sz w:val="20"/>
-                <w:szCs w:val="18"/>
-              </w:rPr>
-              <m:t>16</m:t>
+              <m:t>-0.03∙16</m:t>
             </m:r>
           </m:e>
         </m:d>
@@ -7127,15 +6997,7 @@
             <w:sz w:val="20"/>
             <w:szCs w:val="18"/>
           </w:rPr>
-          <m:t>=</m:t>
-        </m:r>
-        <m:r>
-          <w:rPr>
-            <w:rFonts w:ascii="Cambria Math" w:hAnsi="Cambria Math"/>
-            <w:sz w:val="20"/>
-            <w:szCs w:val="18"/>
-          </w:rPr>
-          <m:t>1.4-0.48=0,92</m:t>
+          <m:t>=1.4-0.48=0,92</m:t>
         </m:r>
       </m:oMath>
       <w:r>
@@ -7492,36 +7354,8 @@
                 <w:szCs w:val="18"/>
                 <w:lang w:val="pl-PL"/>
               </w:rPr>
-              <w:t xml:space="preserve">Di </w:t>
-            </w:r>
-            <w:proofErr w:type="spellStart"/>
-            <w:r>
-              <w:rPr>
-                <w:sz w:val="20"/>
-                <w:szCs w:val="18"/>
-                <w:lang w:val="pl-PL"/>
-              </w:rPr>
-              <w:t>atas</w:t>
-            </w:r>
-            <w:proofErr w:type="spellEnd"/>
-            <w:r>
-              <w:rPr>
-                <w:sz w:val="20"/>
-                <w:szCs w:val="18"/>
-                <w:lang w:val="pl-PL"/>
-              </w:rPr>
-              <w:t xml:space="preserve"> rata-rata / </w:t>
-            </w:r>
-            <w:proofErr w:type="spellStart"/>
-            <w:r>
-              <w:rPr>
-                <w:sz w:val="20"/>
-                <w:szCs w:val="18"/>
-                <w:lang w:val="pl-PL"/>
-              </w:rPr>
-              <w:t>baik</w:t>
-            </w:r>
-            <w:proofErr w:type="spellEnd"/>
+              <w:t>Di atas rata-rata / baik</w:t>
+            </w:r>
           </w:p>
         </w:tc>
       </w:tr>
@@ -7822,61 +7656,7 @@
               <w:szCs w:val="18"/>
               <w:lang w:val="fi-FI"/>
             </w:rPr>
-            <m:t>78</m:t>
-          </m:r>
-          <m:r>
-            <w:rPr>
-              <w:rFonts w:ascii="Cambria Math" w:eastAsiaTheme="minorEastAsia" w:hAnsi="Cambria Math"/>
-              <w:sz w:val="20"/>
-              <w:szCs w:val="18"/>
-              <w:lang w:val="fi-FI"/>
-            </w:rPr>
-            <m:t>×</m:t>
-          </m:r>
-          <m:r>
-            <w:rPr>
-              <w:rFonts w:ascii="Cambria Math" w:eastAsiaTheme="minorEastAsia" w:hAnsi="Cambria Math"/>
-              <w:sz w:val="20"/>
-              <w:szCs w:val="18"/>
-              <w:lang w:val="fi-FI"/>
-            </w:rPr>
-            <m:t>0,38</m:t>
-          </m:r>
-          <m:r>
-            <w:rPr>
-              <w:rFonts w:ascii="Cambria Math" w:eastAsiaTheme="minorEastAsia" w:hAnsi="Cambria Math"/>
-              <w:sz w:val="20"/>
-              <w:szCs w:val="18"/>
-              <w:lang w:val="fi-FI"/>
-            </w:rPr>
-            <m:t>×0,</m:t>
-          </m:r>
-          <m:r>
-            <w:rPr>
-              <w:rFonts w:ascii="Cambria Math" w:eastAsiaTheme="minorEastAsia" w:hAnsi="Cambria Math"/>
-              <w:sz w:val="20"/>
-              <w:szCs w:val="18"/>
-              <w:lang w:val="fi-FI"/>
-            </w:rPr>
-            <m:t>92</m:t>
-          </m:r>
-          <m:r>
-            <w:rPr>
-              <w:rFonts w:ascii="Cambria Math" w:eastAsiaTheme="minorEastAsia" w:hAnsi="Cambria Math"/>
-              <w:sz w:val="20"/>
-              <w:szCs w:val="18"/>
-              <w:lang w:val="fi-FI"/>
-            </w:rPr>
-            <m:t>=</m:t>
-          </m:r>
-          <m:r>
-            <w:rPr>
-              <w:rFonts w:ascii="Cambria Math" w:eastAsiaTheme="minorEastAsia" w:hAnsi="Cambria Math"/>
-              <w:sz w:val="20"/>
-              <w:szCs w:val="18"/>
-              <w:lang w:val="fi-FI"/>
-            </w:rPr>
-            <m:t>27,27</m:t>
+            <m:t>78×0,38×0,92=27,27</m:t>
           </m:r>
         </m:oMath>
       </m:oMathPara>
@@ -8028,34 +7808,7 @@
               <w:szCs w:val="18"/>
               <w:lang w:val="fi-FI"/>
             </w:rPr>
-            <m:t>=</m:t>
-          </m:r>
-          <m:r>
-            <w:rPr>
-              <w:rFonts w:ascii="Cambria Math" w:eastAsiaTheme="minorEastAsia" w:hAnsi="Cambria Math"/>
-              <w:sz w:val="20"/>
-              <w:szCs w:val="18"/>
-              <w:lang w:val="fi-FI"/>
-            </w:rPr>
-            <m:t>27,27</m:t>
-          </m:r>
-          <m:r>
-            <w:rPr>
-              <w:rFonts w:ascii="Cambria Math" w:eastAsiaTheme="minorEastAsia" w:hAnsi="Cambria Math"/>
-              <w:sz w:val="20"/>
-              <w:szCs w:val="18"/>
-              <w:lang w:val="fi-FI"/>
-            </w:rPr>
-            <m:t>×8,2=</m:t>
-          </m:r>
-          <m:r>
-            <w:rPr>
-              <w:rFonts w:ascii="Cambria Math" w:eastAsiaTheme="minorEastAsia" w:hAnsi="Cambria Math"/>
-              <w:sz w:val="20"/>
-              <w:szCs w:val="18"/>
-              <w:lang w:val="fi-FI"/>
-            </w:rPr>
-            <m:t>223,614</m:t>
+            <m:t>=27,27×8,2=223,614</m:t>
           </m:r>
         </m:oMath>
       </m:oMathPara>
@@ -8453,23 +8206,7 @@
               <w:sz w:val="20"/>
               <w:szCs w:val="18"/>
             </w:rPr>
-            <m:t>=</m:t>
-          </m:r>
-          <m:r>
-            <w:rPr>
-              <w:rFonts w:ascii="Cambria Math" w:eastAsiaTheme="minorEastAsia" w:hAnsi="Cambria Math"/>
-              <w:sz w:val="20"/>
-              <w:szCs w:val="18"/>
-            </w:rPr>
-            <m:t>2,8</m:t>
-          </m:r>
-          <m:r>
-            <w:rPr>
-              <w:rFonts w:ascii="Cambria Math" w:eastAsiaTheme="minorEastAsia" w:hAnsi="Cambria Math"/>
-              <w:sz w:val="20"/>
-              <w:szCs w:val="18"/>
-            </w:rPr>
-            <m:t xml:space="preserve"> Bulan</m:t>
+            <m:t>=2,8 Bulan</m:t>
           </m:r>
         </m:oMath>
       </m:oMathPara>
@@ -8940,15 +8677,7 @@
                   <w:sz w:val="20"/>
                   <w:szCs w:val="18"/>
                 </w:rPr>
-                <m:t>2</m:t>
-              </m:r>
-              <m:r>
-                <w:rPr>
-                  <w:rFonts w:ascii="Cambria Math" w:eastAsiaTheme="minorEastAsia" w:hAnsi="Cambria Math"/>
-                  <w:sz w:val="20"/>
-                  <w:szCs w:val="18"/>
-                </w:rPr>
-                <m:t>∙80</m:t>
+                <m:t>2∙80</m:t>
               </m:r>
             </m:den>
           </m:f>
@@ -8988,15 +8717,7 @@
                   <w:sz w:val="20"/>
                   <w:szCs w:val="18"/>
                 </w:rPr>
-                <m:t>16</m:t>
-              </m:r>
-              <m:r>
-                <w:rPr>
-                  <w:rFonts w:ascii="Cambria Math" w:eastAsiaTheme="minorEastAsia" w:hAnsi="Cambria Math"/>
-                  <w:sz w:val="20"/>
-                  <w:szCs w:val="18"/>
-                </w:rPr>
-                <m:t>0</m:t>
+                <m:t>160</m:t>
               </m:r>
             </m:den>
           </m:f>
@@ -9006,23 +8727,7 @@
               <w:sz w:val="20"/>
               <w:szCs w:val="18"/>
             </w:rPr>
-            <m:t>≈</m:t>
-          </m:r>
-          <m:r>
-            <w:rPr>
-              <w:rFonts w:ascii="Cambria Math" w:eastAsiaTheme="minorEastAsia" w:hAnsi="Cambria Math"/>
-              <w:sz w:val="20"/>
-              <w:szCs w:val="18"/>
-            </w:rPr>
-            <m:t>1,4</m:t>
-          </m:r>
-          <m:r>
-            <w:rPr>
-              <w:rFonts w:ascii="Cambria Math" w:eastAsiaTheme="minorEastAsia" w:hAnsi="Cambria Math"/>
-              <w:sz w:val="20"/>
-              <w:szCs w:val="18"/>
-            </w:rPr>
-            <m:t xml:space="preserve"> Bulan</m:t>
+            <m:t>≈1,4 Bulan</m:t>
           </m:r>
         </m:oMath>
       </m:oMathPara>
@@ -9318,16 +9023,7 @@
                   <w:szCs w:val="18"/>
                   <w:lang w:val="fi-FI"/>
                 </w:rPr>
-                <m:t>1,4</m:t>
-              </m:r>
-              <m:r>
-                <w:rPr>
-                  <w:rFonts w:ascii="Cambria Math" w:eastAsiaTheme="minorEastAsia" w:hAnsi="Cambria Math"/>
-                  <w:sz w:val="20"/>
-                  <w:szCs w:val="18"/>
-                  <w:lang w:val="fi-FI"/>
-                </w:rPr>
-                <m:t>×80</m:t>
+                <m:t>1,4×80</m:t>
               </m:r>
             </m:den>
           </m:f>
@@ -9382,43 +9078,7 @@
               <w:szCs w:val="18"/>
               <w:lang w:val="fi-FI"/>
             </w:rPr>
-            <m:t>=</m:t>
-          </m:r>
-          <m:r>
-            <w:rPr>
-              <w:rFonts w:ascii="Cambria Math" w:eastAsiaTheme="minorEastAsia" w:hAnsi="Cambria Math"/>
-              <w:sz w:val="20"/>
-              <w:szCs w:val="18"/>
-              <w:lang w:val="fi-FI"/>
-            </w:rPr>
-            <m:t>1,996</m:t>
-          </m:r>
-          <m:r>
-            <w:rPr>
-              <w:rFonts w:ascii="Cambria Math" w:eastAsiaTheme="minorEastAsia" w:hAnsi="Cambria Math"/>
-              <w:sz w:val="20"/>
-              <w:szCs w:val="18"/>
-              <w:lang w:val="fi-FI"/>
-            </w:rPr>
-            <m:t xml:space="preserve"> ≈</m:t>
-          </m:r>
-          <m:r>
-            <w:rPr>
-              <w:rFonts w:ascii="Cambria Math" w:eastAsiaTheme="minorEastAsia" w:hAnsi="Cambria Math"/>
-              <w:sz w:val="20"/>
-              <w:szCs w:val="18"/>
-              <w:lang w:val="fi-FI"/>
-            </w:rPr>
-            <m:t>2</m:t>
-          </m:r>
-          <m:r>
-            <w:rPr>
-              <w:rFonts w:ascii="Cambria Math" w:eastAsiaTheme="minorEastAsia" w:hAnsi="Cambria Math"/>
-              <w:sz w:val="20"/>
-              <w:szCs w:val="18"/>
-              <w:lang w:val="fi-FI"/>
-            </w:rPr>
-            <m:t xml:space="preserve">  </m:t>
+            <m:t xml:space="preserve">=1,996 ≈2  </m:t>
           </m:r>
           <m:r>
             <m:rPr>
@@ -9714,23 +9374,13 @@
           <w:szCs w:val="18"/>
         </w:rPr>
       </w:pPr>
-      <w:proofErr w:type="spellStart"/>
       <w:r>
         <w:rPr>
           <w:rFonts w:eastAsiaTheme="minorEastAsia"/>
           <w:sz w:val="20"/>
           <w:szCs w:val="18"/>
         </w:rPr>
-        <w:t>Dengan</w:t>
-      </w:r>
-      <w:proofErr w:type="spellEnd"/>
-      <w:r>
-        <w:rPr>
-          <w:rFonts w:eastAsiaTheme="minorEastAsia"/>
-          <w:sz w:val="20"/>
-          <w:szCs w:val="18"/>
-        </w:rPr>
-        <w:t xml:space="preserve"> </w:t>
+        <w:t xml:space="preserve">Dengan </w:t>
       </w:r>
       <w:proofErr w:type="spellStart"/>
       <w:r>
@@ -10060,41 +9710,13 @@
               <w:sz w:val="20"/>
               <w:szCs w:val="18"/>
             </w:rPr>
-            <m:t>=Rp 7.826.49</m:t>
-          </m:r>
-          <m:r>
-            <w:rPr>
-              <w:rFonts w:ascii="Cambria Math" w:eastAsiaTheme="minorEastAsia" w:hAnsi="Cambria Math"/>
-              <w:sz w:val="20"/>
-              <w:szCs w:val="18"/>
-            </w:rPr>
-            <m:t>0</m:t>
+            <m:t>=Rp 7.826.490</m:t>
           </m:r>
         </m:oMath>
       </m:oMathPara>
     </w:p>
     <w:p>
       <w:pPr>
-        <w:spacing w:after="160" w:line="259" w:lineRule="auto"/>
-        <w:jc w:val="left"/>
-        <w:rPr>
-          <w:rFonts w:eastAsiaTheme="minorEastAsia"/>
-          <w:sz w:val="20"/>
-          <w:szCs w:val="18"/>
-        </w:rPr>
-      </w:pPr>
-      <w:r>
-        <w:rPr>
-          <w:rFonts w:eastAsiaTheme="minorEastAsia"/>
-          <w:sz w:val="20"/>
-          <w:szCs w:val="18"/>
-        </w:rPr>
-        <w:lastRenderedPageBreak/>
-        <w:br w:type="page"/>
-      </w:r>
-    </w:p>
-    <w:p>
-      <w:pPr>
         <w:rPr>
           <w:sz w:val="20"/>
           <w:szCs w:val="18"/>
@@ -10131,23 +9753,7 @@
           <w:sz w:val="20"/>
           <w:szCs w:val="18"/>
         </w:rPr>
-        <w:t xml:space="preserve"> Use Case Admin (</w:t>
-      </w:r>
-      <w:proofErr w:type="spellStart"/>
-      <w:r>
-        <w:rPr>
-          <w:sz w:val="20"/>
-          <w:szCs w:val="18"/>
-        </w:rPr>
-        <w:t>Metode</w:t>
-      </w:r>
-      <w:proofErr w:type="spellEnd"/>
-      <w:r>
-        <w:rPr>
-          <w:sz w:val="20"/>
-          <w:szCs w:val="18"/>
-        </w:rPr>
-        <w:t xml:space="preserve"> Use Case Point)</w:t>
+        <w:t xml:space="preserve"> Use Case Admin (Metode Use Case Point)</w:t>
       </w:r>
     </w:p>
     <w:p>
@@ -10553,7 +10159,7 @@
           <w:szCs w:val="18"/>
         </w:rPr>
         <w:pict w14:anchorId="6C2E05FA">
-          <v:rect id="_x0000_i1235" style="width:497.25pt;height:.75pt" o:hrpct="0" o:hralign="center" o:hrstd="t" o:hr="t" fillcolor="#a0a0a0" stroked="f"/>
+          <v:rect id="_x0000_i1025" style="width:497.25pt;height:.75pt" o:hrpct="0" o:hralign="center" o:hrstd="t" o:hr="t" fillcolor="#a0a0a0" stroked="f"/>
         </w:pict>
       </w:r>
     </w:p>
@@ -10778,7 +10384,7 @@
           <w:szCs w:val="18"/>
         </w:rPr>
         <w:pict w14:anchorId="3CA8325E">
-          <v:rect id="_x0000_i1236" style="width:497.25pt;height:.75pt" o:hrpct="0" o:hralign="center" o:hrstd="t" o:hr="t" fillcolor="#a0a0a0" stroked="f"/>
+          <v:rect id="_x0000_i1026" style="width:497.25pt;height:.75pt" o:hrpct="0" o:hralign="center" o:hrstd="t" o:hr="t" fillcolor="#a0a0a0" stroked="f"/>
         </w:pict>
       </w:r>
     </w:p>
@@ -11376,7 +10982,7 @@
           <w:szCs w:val="18"/>
         </w:rPr>
         <w:pict w14:anchorId="1BA12561">
-          <v:rect id="_x0000_i1237" style="width:497.25pt;height:.75pt" o:hrpct="0" o:hralign="center" o:hrstd="t" o:hr="t" fillcolor="#a0a0a0" stroked="f"/>
+          <v:rect id="_x0000_i1027" style="width:497.25pt;height:.75pt" o:hrpct="0" o:hralign="center" o:hrstd="t" o:hr="t" fillcolor="#a0a0a0" stroked="f"/>
         </w:pict>
       </w:r>
     </w:p>
@@ -12003,7 +11609,7 @@
           <w:szCs w:val="18"/>
         </w:rPr>
         <w:pict w14:anchorId="1023BCED">
-          <v:rect id="_x0000_i1238" style="width:497.25pt;height:.75pt" o:hrpct="0" o:hralign="center" o:hrstd="t" o:hr="t" fillcolor="#a0a0a0" stroked="f"/>
+          <v:rect id="_x0000_i1028" style="width:497.25pt;height:.75pt" o:hrpct="0" o:hralign="center" o:hrstd="t" o:hr="t" fillcolor="#a0a0a0" stroked="f"/>
         </w:pict>
       </w:r>
     </w:p>
@@ -12559,7 +12165,7 @@
           <w:szCs w:val="18"/>
         </w:rPr>
         <w:pict w14:anchorId="46139CE6">
-          <v:rect id="_x0000_i1239" style="width:497.25pt;height:.75pt" o:hrpct="0" o:hralign="center" o:hrstd="t" o:hr="t" fillcolor="#a0a0a0" stroked="f"/>
+          <v:rect id="_x0000_i1029" style="width:497.25pt;height:.75pt" o:hrpct="0" o:hralign="center" o:hrstd="t" o:hr="t" fillcolor="#a0a0a0" stroked="f"/>
         </w:pict>
       </w:r>
     </w:p>
@@ -13114,7 +12720,7 @@
           <w:szCs w:val="18"/>
         </w:rPr>
         <w:pict w14:anchorId="7977045C">
-          <v:rect id="_x0000_i1240" style="width:497.25pt;height:.75pt" o:hrpct="0" o:hralign="center" o:hrstd="t" o:hr="t" fillcolor="#a0a0a0" stroked="f"/>
+          <v:rect id="_x0000_i1030" style="width:497.25pt;height:.75pt" o:hrpct="0" o:hralign="center" o:hrstd="t" o:hr="t" fillcolor="#a0a0a0" stroked="f"/>
         </w:pict>
       </w:r>
     </w:p>
@@ -13604,7 +13210,7 @@
           <w:szCs w:val="18"/>
         </w:rPr>
         <w:pict w14:anchorId="65EF3155">
-          <v:rect id="_x0000_i1241" style="width:497.25pt;height:.75pt" o:hrpct="0" o:hralign="center" o:hrstd="t" o:hr="t" fillcolor="#a0a0a0" stroked="f"/>
+          <v:rect id="_x0000_i1031" style="width:497.25pt;height:.75pt" o:hrpct="0" o:hralign="center" o:hrstd="t" o:hr="t" fillcolor="#a0a0a0" stroked="f"/>
         </w:pict>
       </w:r>
     </w:p>
@@ -14113,7 +13719,7 @@
 </file>
 
 <file path=word/numbering.xml><?xml version="1.0" encoding="utf-8"?>
-<w:numbering xmlns:wpc="http://schemas.microsoft.com/office/word/2010/wordprocessingCanvas" xmlns:cx="http://schemas.microsoft.com/office/drawing/2014/chartex" xmlns:cx1="http://schemas.microsoft.com/office/drawing/2015/9/8/chartex" xmlns:cx2="http://schemas.microsoft.com/office/drawing/2015/10/21/chartex" xmlns:cx3="http://schemas.microsoft.com/office/drawing/2016/5/9/chartex" xmlns:cx4="http://schemas.microsoft.com/office/drawing/2016/5/10/chartex" xmlns:cx5="http://schemas.microsoft.com/office/drawing/2016/5/11/chartex" xmlns:cx6="http://schemas.microsoft.com/office/drawing/2016/5/12/chartex" xmlns:cx7="http://schemas.microsoft.com/office/drawing/2016/5/13/chartex" xmlns:cx8="http://schemas.microsoft.com/office/drawing/2016/5/14/chartex" xmlns:mc="http://schemas.openxmlformats.org/markup-compatibility/2006" xmlns:aink="http://schemas.microsoft.com/office/drawing/2016/ink" xmlns:am3d="http://schemas.microsoft.com/office/drawing/2017/model3d" xmlns:o="urn:schemas-microsoft-com:office:office" xmlns:oel="http://schemas.microsoft.com/office/2019/extlst" xmlns:r="http://schemas.openxmlformats.org/officeDocument/2006/relationships" xmlns:m="http://schemas.openxmlformats.org/officeDocument/2006/math" xmlns:v="urn:schemas-microsoft-com:vml" xmlns:wp14="http://schemas.microsoft.com/office/word/2010/wordprocessingDrawing" xmlns:wp="http://schemas.openxmlformats.org/drawingml/2006/wordprocessingDrawing" xmlns:w10="urn:schemas-microsoft-com:office:word" xmlns:w="http://schemas.openxmlformats.org/wordprocessingml/2006/main" xmlns:w14="http://schemas.microsoft.com/office/word/2010/wordml" xmlns:w15="http://schemas.microsoft.com/office/word/2012/wordml" xmlns:w16cex="http://schemas.microsoft.com/office/word/2018/wordml/cex" xmlns:w16cid="http://schemas.microsoft.com/office/word/2016/wordml/cid" xmlns:w16="http://schemas.microsoft.com/office/word/2018/wordml" xmlns:w16sdtdh="http://schemas.microsoft.com/office/word/2020/wordml/sdtdatahash" xmlns:w16se="http://schemas.microsoft.com/office/word/2015/wordml/symex" xmlns:wpg="http://schemas.microsoft.com/office/word/2010/wordprocessingGroup" xmlns:wpi="http://schemas.microsoft.com/office/word/2010/wordprocessingInk" xmlns:wne="http://schemas.microsoft.com/office/word/2006/wordml" xmlns:wps="http://schemas.microsoft.com/office/word/2010/wordprocessingShape" mc:Ignorable="w14 w15 w16se w16cid w16 w16cex w16sdtdh wp14">
+<w:numbering xmlns:wpc="http://schemas.microsoft.com/office/word/2010/wordprocessingCanvas" xmlns:cx="http://schemas.microsoft.com/office/drawing/2014/chartex" xmlns:cx1="http://schemas.microsoft.com/office/drawing/2015/9/8/chartex" xmlns:cx2="http://schemas.microsoft.com/office/drawing/2015/10/21/chartex" xmlns:cx3="http://schemas.microsoft.com/office/drawing/2016/5/9/chartex" xmlns:cx4="http://schemas.microsoft.com/office/drawing/2016/5/10/chartex" xmlns:cx5="http://schemas.microsoft.com/office/drawing/2016/5/11/chartex" xmlns:cx6="http://schemas.microsoft.com/office/drawing/2016/5/12/chartex" xmlns:cx7="http://schemas.microsoft.com/office/drawing/2016/5/13/chartex" xmlns:cx8="http://schemas.microsoft.com/office/drawing/2016/5/14/chartex" xmlns:mc="http://schemas.openxmlformats.org/markup-compatibility/2006" xmlns:aink="http://schemas.microsoft.com/office/drawing/2016/ink" xmlns:am3d="http://schemas.microsoft.com/office/drawing/2017/model3d" xmlns:o="urn:schemas-microsoft-com:office:office" xmlns:oel="http://schemas.microsoft.com/office/2019/extlst" xmlns:r="http://schemas.openxmlformats.org/officeDocument/2006/relationships" xmlns:m="http://schemas.openxmlformats.org/officeDocument/2006/math" xmlns:v="urn:schemas-microsoft-com:vml" xmlns:wp14="http://schemas.microsoft.com/office/word/2010/wordprocessingDrawing" xmlns:wp="http://schemas.openxmlformats.org/drawingml/2006/wordprocessingDrawing" xmlns:w10="urn:schemas-microsoft-com:office:word" xmlns:w="http://schemas.openxmlformats.org/wordprocessingml/2006/main" xmlns:w14="http://schemas.microsoft.com/office/word/2010/wordml" xmlns:w15="http://schemas.microsoft.com/office/word/2012/wordml" xmlns:w16cex="http://schemas.microsoft.com/office/word/2018/wordml/cex" xmlns:w16cid="http://schemas.microsoft.com/office/word/2016/wordml/cid" xmlns:w16="http://schemas.microsoft.com/office/word/2018/wordml" xmlns:w16du="http://schemas.microsoft.com/office/word/2023/wordml/word16du" xmlns:w16sdtdh="http://schemas.microsoft.com/office/word/2020/wordml/sdtdatahash" xmlns:w16sdtfl="http://schemas.microsoft.com/office/word/2024/wordml/sdtformatlock" xmlns:w16se="http://schemas.microsoft.com/office/word/2015/wordml/symex" xmlns:wpg="http://schemas.microsoft.com/office/word/2010/wordprocessingGroup" xmlns:wpi="http://schemas.microsoft.com/office/word/2010/wordprocessingInk" xmlns:wne="http://schemas.microsoft.com/office/word/2006/wordml" xmlns:wps="http://schemas.microsoft.com/office/word/2010/wordprocessingShape" mc:Ignorable="w14 w15 w16se w16cid w16 w16cex w16sdtdh w16sdtfl w16du wp14">
   <w:abstractNum w:abstractNumId="0" w15:restartNumberingAfterBreak="0">
     <w:nsid w:val="01AF3682"/>
     <w:multiLevelType w:val="multilevel"/>
@@ -16354,7 +15960,7 @@
 </file>
 
 <file path=word/styles.xml><?xml version="1.0" encoding="utf-8"?>
-<w:styles xmlns:mc="http://schemas.openxmlformats.org/markup-compatibility/2006" xmlns:r="http://schemas.openxmlformats.org/officeDocument/2006/relationships" xmlns:w="http://schemas.openxmlformats.org/wordprocessingml/2006/main" xmlns:w14="http://schemas.microsoft.com/office/word/2010/wordml" xmlns:w15="http://schemas.microsoft.com/office/word/2012/wordml" xmlns:w16cex="http://schemas.microsoft.com/office/word/2018/wordml/cex" xmlns:w16cid="http://schemas.microsoft.com/office/word/2016/wordml/cid" xmlns:w16="http://schemas.microsoft.com/office/word/2018/wordml" xmlns:w16sdtdh="http://schemas.microsoft.com/office/word/2020/wordml/sdtdatahash" xmlns:w16se="http://schemas.microsoft.com/office/word/2015/wordml/symex" mc:Ignorable="w14 w15 w16se w16cid w16 w16cex w16sdtdh">
+<w:styles xmlns:mc="http://schemas.openxmlformats.org/markup-compatibility/2006" xmlns:r="http://schemas.openxmlformats.org/officeDocument/2006/relationships" xmlns:w="http://schemas.openxmlformats.org/wordprocessingml/2006/main" xmlns:w14="http://schemas.microsoft.com/office/word/2010/wordml" xmlns:w15="http://schemas.microsoft.com/office/word/2012/wordml" xmlns:w16cex="http://schemas.microsoft.com/office/word/2018/wordml/cex" xmlns:w16cid="http://schemas.microsoft.com/office/word/2016/wordml/cid" xmlns:w16="http://schemas.microsoft.com/office/word/2018/wordml" xmlns:w16du="http://schemas.microsoft.com/office/word/2023/wordml/word16du" xmlns:w16sdtdh="http://schemas.microsoft.com/office/word/2020/wordml/sdtdatahash" xmlns:w16sdtfl="http://schemas.microsoft.com/office/word/2024/wordml/sdtformatlock" xmlns:w16se="http://schemas.microsoft.com/office/word/2015/wordml/symex" mc:Ignorable="w14 w15 w16se w16cid w16 w16cex w16sdtdh w16sdtfl w16du">
   <w:docDefaults>
     <w:rPrDefault>
       <w:rPr>
@@ -16851,6 +16457,7 @@
   <w:style w:type="character" w:default="1" w:styleId="DefaultParagraphFont">
     <w:name w:val="Default Paragraph Font"/>
     <w:uiPriority w:val="1"/>
+    <w:semiHidden/>
     <w:unhideWhenUsed/>
   </w:style>
   <w:style w:type="table" w:default="1" w:styleId="TableNormal">

</xml_diff>